<commit_message>
Added Functional Spec PDF
</commit_message>
<xml_diff>
--- a/Documentation/Data Science Project Technical Specification.docx
+++ b/Documentation/Data Science Project Technical Specification.docx
@@ -118,19 +118,11 @@
           <w:color w:val="auto"/>
         </w:rPr>
       </w:pPr>
-      <w:proofErr w:type="gramStart"/>
       <w:r>
         <w:rPr>
           <w:color w:val="auto"/>
         </w:rPr>
-        <w:t>South East</w:t>
-      </w:r>
-      <w:proofErr w:type="gramEnd"/>
-      <w:r>
-        <w:rPr>
-          <w:color w:val="auto"/>
-        </w:rPr>
-        <w:t xml:space="preserve"> Technological University</w:t>
+        <w:t>South East Technological University</w:t>
       </w:r>
     </w:p>
     <w:p>
@@ -147,7 +139,7 @@
           <w:rFonts w:eastAsiaTheme="minorHAnsi"/>
           <w:color w:val="auto"/>
         </w:rPr>
-        <w:t>[Date of Submission]</w:t>
+        <w:t>28/11/2025</w:t>
       </w:r>
     </w:p>
     <w:p>
@@ -789,24 +781,14 @@
     </w:p>
     <w:p>
       <w:r>
-        <w:t xml:space="preserve">Python will be used in </w:t>
-      </w:r>
-      <w:proofErr w:type="spellStart"/>
-      <w:r>
-        <w:t>Jupyter</w:t>
-      </w:r>
-      <w:proofErr w:type="spellEnd"/>
-      <w:r>
-        <w:t xml:space="preserve"> Notebook to work with the dataset. Some libraries that will be needed are the </w:t>
+        <w:t xml:space="preserve">Python will be used in Jupyter Notebook to work with the dataset. Some libraries that will be needed are the </w:t>
       </w:r>
       <w:r>
         <w:t>scikit-learn (</w:t>
       </w:r>
-      <w:proofErr w:type="spellStart"/>
       <w:r>
         <w:t>sklearn</w:t>
       </w:r>
-      <w:proofErr w:type="spellEnd"/>
       <w:r>
         <w:t>)</w:t>
       </w:r>

</xml_diff>